<commit_message>
Final Report Done Correctly.
</commit_message>
<xml_diff>
--- a/ReportofWebsiteDevelopmentAssessment1.docx
+++ b/ReportofWebsiteDevelopmentAssessment1.docx
@@ -719,29 +719,7 @@
           <w:lang w:eastAsia="en-AU"/>
           <w14:ligatures w14:val="none"/>
         </w:rPr>
-        <w:t>Product Details Page:</w:t>
-      </w:r>
-      <w:r>
-        <w:rPr>
-          <w:rFonts w:ascii="Calibri" w:eastAsia="Times New Roman" w:hAnsi="Calibri" w:cs="Calibri"/>
-          <w:kern w:val="0"/>
-          <w:sz w:val="24"/>
-          <w:szCs w:val="24"/>
-          <w:lang w:eastAsia="en-AU"/>
-          <w14:ligatures w14:val="none"/>
-        </w:rPr>
-        <w:t xml:space="preserve"> </w:t>
-      </w:r>
-      <w:r>
-        <w:rPr>
-          <w:rFonts w:ascii="Calibri" w:eastAsia="Times New Roman" w:hAnsi="Calibri" w:cs="Calibri"/>
-          <w:kern w:val="0"/>
-          <w:sz w:val="24"/>
-          <w:szCs w:val="24"/>
-          <w:lang w:eastAsia="en-AU"/>
-          <w14:ligatures w14:val="none"/>
-        </w:rPr>
-        <w:t>The Product Details Page shows detailed information about a selected product, including its name, description, price, and image. Using ASP.NET MVC, an action in the Catalogue Controller handles this display. Users can select a quantity and add items to the cart through the Add to Cart button, which updates the shopping cart service accordingly.</w:t>
+        <w:t>Product Details Page: The Product Details Page shows detailed information about a selected product, including its name, description, price, and image. Using ASP.NET MVC, an action in the Catalogue Controller handles this display. Users can select a quantity and add items to the cart through the Add to Cart button, which updates the shopping cart service accordingly.</w:t>
       </w:r>
     </w:p>
     <w:p>
@@ -786,29 +764,7 @@
           <w:lang w:eastAsia="en-AU"/>
           <w14:ligatures w14:val="none"/>
         </w:rPr>
-        <w:t>Shopping Cart:</w:t>
-      </w:r>
-      <w:r>
-        <w:rPr>
-          <w:rFonts w:ascii="Calibri" w:eastAsia="Times New Roman" w:hAnsi="Calibri" w:cs="Calibri"/>
-          <w:kern w:val="0"/>
-          <w:sz w:val="24"/>
-          <w:szCs w:val="24"/>
-          <w:lang w:eastAsia="en-AU"/>
-          <w14:ligatures w14:val="none"/>
-        </w:rPr>
-        <w:t xml:space="preserve"> </w:t>
-      </w:r>
-      <w:r>
-        <w:rPr>
-          <w:rFonts w:ascii="Calibri" w:eastAsia="Times New Roman" w:hAnsi="Calibri" w:cs="Calibri"/>
-          <w:kern w:val="0"/>
-          <w:sz w:val="24"/>
-          <w:szCs w:val="24"/>
-          <w:lang w:eastAsia="en-AU"/>
-          <w14:ligatures w14:val="none"/>
-        </w:rPr>
-        <w:t>The Shopping Cart is a service that manages products added by users. It lists each product's name, price, quantity, and total cost. The total price of all items is displayed at the bottom, and a Delete button allows users to remove items, updating the total price dynamically.</w:t>
+        <w:t>Shopping Cart: The Shopping Cart is a service that manages products added by users. It lists each product's name, price, quantity, and total cost. The total price of all items is displayed at the bottom, and a Delete button allows users to remove items, updating the total price dynamically.</w:t>
       </w:r>
     </w:p>
     <w:p>
@@ -1049,16 +1005,62 @@
           <w:rFonts w:ascii="Calibri" w:hAnsi="Calibri" w:cs="Calibri"/>
           <w:sz w:val="24"/>
           <w:szCs w:val="24"/>
-          <w:lang w:val="en-US"/>
-        </w:rPr>
-      </w:pPr>
-      <w:r>
-        <w:rPr>
-          <w:rFonts w:ascii="Calibri" w:hAnsi="Calibri" w:cs="Calibri"/>
-          <w:sz w:val="24"/>
-          <w:szCs w:val="24"/>
-          <w:lang w:val="en-US"/>
-        </w:rPr>
+        </w:rPr>
+      </w:pPr>
+    </w:p>
+    <w:p>
+      <w:pPr>
+        <w:rPr>
+          <w:rFonts w:ascii="Calibri" w:hAnsi="Calibri" w:cs="Calibri"/>
+          <w:sz w:val="24"/>
+          <w:szCs w:val="24"/>
+        </w:rPr>
+      </w:pPr>
+    </w:p>
+    <w:p>
+      <w:pPr>
+        <w:rPr>
+          <w:rFonts w:ascii="Calibri" w:hAnsi="Calibri" w:cs="Calibri"/>
+          <w:sz w:val="24"/>
+          <w:szCs w:val="24"/>
+        </w:rPr>
+      </w:pPr>
+    </w:p>
+    <w:p>
+      <w:pPr>
+        <w:rPr>
+          <w:rFonts w:ascii="Calibri" w:hAnsi="Calibri" w:cs="Calibri"/>
+          <w:sz w:val="24"/>
+          <w:szCs w:val="24"/>
+        </w:rPr>
+      </w:pPr>
+    </w:p>
+    <w:p>
+      <w:pPr>
+        <w:rPr>
+          <w:rFonts w:ascii="Calibri" w:hAnsi="Calibri" w:cs="Calibri"/>
+          <w:sz w:val="24"/>
+          <w:szCs w:val="24"/>
+        </w:rPr>
+      </w:pPr>
+    </w:p>
+    <w:p>
+      <w:pPr>
+        <w:rPr>
+          <w:rFonts w:ascii="Calibri" w:hAnsi="Calibri" w:cs="Calibri"/>
+          <w:sz w:val="24"/>
+          <w:szCs w:val="24"/>
+          <w:lang w:val="en-US"/>
+        </w:rPr>
+      </w:pPr>
+      <w:r>
+        <w:rPr>
+          <w:rFonts w:ascii="Calibri" w:hAnsi="Calibri" w:cs="Calibri"/>
+          <w:sz w:val="24"/>
+          <w:szCs w:val="24"/>
+          <w:lang w:val="en-US"/>
+        </w:rPr>
+        <w:lastRenderedPageBreak/>
         <w:t>8. Testing Diagrams:</w:t>
       </w:r>
     </w:p>
@@ -1068,32 +1070,115 @@
           <w:rFonts w:ascii="Calibri" w:hAnsi="Calibri" w:cs="Calibri"/>
           <w:sz w:val="24"/>
           <w:szCs w:val="24"/>
-          <w:lang w:val="en-US"/>
-        </w:rPr>
-      </w:pPr>
-    </w:p>
-    <w:p>
-      <w:pPr>
-        <w:rPr>
-          <w:rFonts w:ascii="Calibri" w:hAnsi="Calibri" w:cs="Calibri"/>
-          <w:sz w:val="24"/>
-          <w:szCs w:val="24"/>
-          <w:lang w:val="en-US"/>
-        </w:rPr>
-      </w:pPr>
-      <w:r>
-        <w:rPr>
-          <w:rFonts w:ascii="Calibri" w:hAnsi="Calibri" w:cs="Calibri"/>
-          <w:sz w:val="24"/>
-          <w:szCs w:val="24"/>
-          <w:lang w:val="en-US"/>
-        </w:rPr>
-        <w:lastRenderedPageBreak/>
+        </w:rPr>
+      </w:pPr>
+      <w:r>
+        <w:rPr>
+          <w:rFonts w:ascii="Calibri" w:hAnsi="Calibri" w:cs="Calibri"/>
+          <w:sz w:val="24"/>
+          <w:szCs w:val="24"/>
+        </w:rPr>
+        <w:t xml:space="preserve">The Pasticceria Papa homepage warmly welcomes visitors and showcases a variety of delicious bakery items, like cakes, pastries, and bread. At the top, a clear navigation bar helps users easily explore the website, offering links to the home page, about section, contact details, product </w:t>
+      </w:r>
+      <w:r>
+        <w:rPr>
+          <w:rFonts w:ascii="Calibri" w:hAnsi="Calibri" w:cs="Calibri"/>
+          <w:sz w:val="24"/>
+          <w:szCs w:val="24"/>
+        </w:rPr>
+        <w:t>catalogue</w:t>
+      </w:r>
+      <w:r>
+        <w:rPr>
+          <w:rFonts w:ascii="Calibri" w:hAnsi="Calibri" w:cs="Calibri"/>
+          <w:sz w:val="24"/>
+          <w:szCs w:val="24"/>
+        </w:rPr>
+        <w:t>, and shopping cart.</w:t>
+      </w:r>
+    </w:p>
+    <w:p>
+      <w:pPr>
+        <w:rPr>
+          <w:rFonts w:ascii="Calibri" w:hAnsi="Calibri" w:cs="Calibri"/>
+          <w:sz w:val="24"/>
+          <w:szCs w:val="24"/>
+        </w:rPr>
+      </w:pPr>
+      <w:r>
+        <w:rPr>
+          <w:rFonts w:ascii="Calibri" w:hAnsi="Calibri" w:cs="Calibri"/>
+          <w:sz w:val="24"/>
+          <w:szCs w:val="24"/>
+        </w:rPr>
+        <w:t xml:space="preserve">The </w:t>
+      </w:r>
+      <w:r>
+        <w:rPr>
+          <w:rFonts w:ascii="Calibri" w:hAnsi="Calibri" w:cs="Calibri"/>
+          <w:sz w:val="24"/>
+          <w:szCs w:val="24"/>
+        </w:rPr>
+        <w:t>centre</w:t>
+      </w:r>
+      <w:r>
+        <w:rPr>
+          <w:rFonts w:ascii="Calibri" w:hAnsi="Calibri" w:cs="Calibri"/>
+          <w:sz w:val="24"/>
+          <w:szCs w:val="24"/>
+        </w:rPr>
+        <w:t xml:space="preserve"> of the page features a welcome message introducing the bakery's tradition of high-quality, handcrafted goods. Below, a vibrant image carousel displays popular products like brioche and croissant scrolls, with captions describing each item.</w:t>
+      </w:r>
+    </w:p>
+    <w:p>
+      <w:pPr>
+        <w:rPr>
+          <w:rFonts w:ascii="Calibri" w:hAnsi="Calibri" w:cs="Calibri"/>
+          <w:sz w:val="24"/>
+          <w:szCs w:val="24"/>
+        </w:rPr>
+      </w:pPr>
+      <w:r>
+        <w:rPr>
+          <w:rFonts w:ascii="Calibri" w:hAnsi="Calibri" w:cs="Calibri"/>
+          <w:sz w:val="24"/>
+          <w:szCs w:val="24"/>
+        </w:rPr>
+        <w:t>With a blue background and contrasting white text, the design is clean and inviting. The responsive layout, powered by Bootstrap 5.3, ensures it looks great on any device, and the locally hosted files make it fast and reliable.</w:t>
+      </w:r>
+    </w:p>
+    <w:p>
+      <w:pPr>
+        <w:rPr>
+          <w:rFonts w:ascii="Calibri" w:hAnsi="Calibri" w:cs="Calibri"/>
+          <w:sz w:val="24"/>
+          <w:szCs w:val="24"/>
+          <w:lang w:val="en-US"/>
+        </w:rPr>
+      </w:pPr>
+    </w:p>
+    <w:p>
+      <w:pPr>
+        <w:rPr>
+          <w:rFonts w:ascii="Calibri" w:hAnsi="Calibri" w:cs="Calibri"/>
+          <w:sz w:val="24"/>
+          <w:szCs w:val="24"/>
+          <w:lang w:val="en-US"/>
+        </w:rPr>
+      </w:pPr>
+      <w:r>
+        <w:rPr>
+          <w:rFonts w:ascii="Calibri" w:hAnsi="Calibri" w:cs="Calibri"/>
+          <w:noProof/>
+          <w:sz w:val="24"/>
+          <w:szCs w:val="24"/>
+          <w:lang w:val="en-US"/>
+        </w:rPr>
         <w:drawing>
-          <wp:inline distT="0" distB="0" distL="0" distR="0" wp14:anchorId="6F56970B" wp14:editId="4B843DBC">
-            <wp:extent cx="5731510" cy="2862580"/>
+          <wp:inline distT="0" distB="0" distL="0" distR="0" wp14:anchorId="05CBF795" wp14:editId="0CDE326B">
+            <wp:extent cx="5731510" cy="2689225"/>
             <wp:effectExtent l="0" t="0" r="2540" b="0"/>
-            <wp:docPr id="583214540" name="Picture 1"/>
+            <wp:docPr id="480360117" name="Picture 1" descr="A screenshot of a computer&#10;&#10;Description automatically generated"/>
             <wp:cNvGraphicFramePr>
               <a:graphicFrameLocks xmlns:a="http://schemas.openxmlformats.org/drawingml/2006/main" noChangeAspect="1"/>
             </wp:cNvGraphicFramePr>
@@ -1101,7 +1186,7 @@
               <a:graphicData uri="http://schemas.openxmlformats.org/drawingml/2006/picture">
                 <pic:pic xmlns:pic="http://schemas.openxmlformats.org/drawingml/2006/picture">
                   <pic:nvPicPr>
-                    <pic:cNvPr id="583214540" name=""/>
+                    <pic:cNvPr id="480360117" name="Picture 1" descr="A screenshot of a computer&#10;&#10;Description automatically generated"/>
                     <pic:cNvPicPr/>
                   </pic:nvPicPr>
                   <pic:blipFill>
@@ -1113,7 +1198,7 @@
                   <pic:spPr>
                     <a:xfrm>
                       <a:off x="0" y="0"/>
-                      <a:ext cx="5731510" cy="2862580"/>
+                      <a:ext cx="5731510" cy="2689225"/>
                     </a:xfrm>
                     <a:prstGeom prst="rect">
                       <a:avLst/>
@@ -1135,6 +1220,16 @@
           <w:lang w:val="en-US"/>
         </w:rPr>
       </w:pPr>
+    </w:p>
+    <w:p>
+      <w:pPr>
+        <w:rPr>
+          <w:rFonts w:ascii="Calibri" w:hAnsi="Calibri" w:cs="Calibri"/>
+          <w:sz w:val="24"/>
+          <w:szCs w:val="24"/>
+          <w:lang w:val="en-US"/>
+        </w:rPr>
+      </w:pPr>
       <w:r>
         <w:rPr>
           <w:rFonts w:ascii="Calibri" w:hAnsi="Calibri" w:cs="Calibri"/>
@@ -1143,10 +1238,10 @@
           <w:lang w:val="en-US"/>
         </w:rPr>
         <w:drawing>
-          <wp:inline distT="0" distB="0" distL="0" distR="0" wp14:anchorId="767788CD" wp14:editId="089626A6">
-            <wp:extent cx="5731510" cy="2814955"/>
+          <wp:inline distT="0" distB="0" distL="0" distR="0" wp14:anchorId="00468755" wp14:editId="5AEDA052">
+            <wp:extent cx="5731510" cy="2605405"/>
             <wp:effectExtent l="0" t="0" r="2540" b="4445"/>
-            <wp:docPr id="669929027" name="Picture 1" descr="A screenshot of a computer&#10;&#10;Description automatically generated"/>
+            <wp:docPr id="1775790292" name="Picture 1"/>
             <wp:cNvGraphicFramePr>
               <a:graphicFrameLocks xmlns:a="http://schemas.openxmlformats.org/drawingml/2006/main" noChangeAspect="1"/>
             </wp:cNvGraphicFramePr>
@@ -1154,7 +1249,7 @@
               <a:graphicData uri="http://schemas.openxmlformats.org/drawingml/2006/picture">
                 <pic:pic xmlns:pic="http://schemas.openxmlformats.org/drawingml/2006/picture">
                   <pic:nvPicPr>
-                    <pic:cNvPr id="669929027" name="Picture 1" descr="A screenshot of a computer&#10;&#10;Description automatically generated"/>
+                    <pic:cNvPr id="1775790292" name=""/>
                     <pic:cNvPicPr/>
                   </pic:nvPicPr>
                   <pic:blipFill>
@@ -1166,7 +1261,7 @@
                   <pic:spPr>
                     <a:xfrm>
                       <a:off x="0" y="0"/>
-                      <a:ext cx="5731510" cy="2814955"/>
+                      <a:ext cx="5731510" cy="2605405"/>
                     </a:xfrm>
                     <a:prstGeom prst="rect">
                       <a:avLst/>
@@ -1178,18 +1273,206 @@
           </wp:inline>
         </w:drawing>
       </w:r>
-      <w:r>
-        <w:rPr>
-          <w:rFonts w:ascii="Calibri" w:hAnsi="Calibri" w:cs="Calibri"/>
+    </w:p>
+    <w:p>
+      <w:pPr>
+        <w:rPr>
+          <w:rFonts w:ascii="Calibri" w:hAnsi="Calibri" w:cs="Calibri"/>
+          <w:sz w:val="24"/>
+          <w:szCs w:val="24"/>
+          <w:lang w:val="en-US"/>
+        </w:rPr>
+      </w:pPr>
+    </w:p>
+    <w:p>
+      <w:pPr>
+        <w:rPr>
+          <w:rFonts w:ascii="Calibri" w:hAnsi="Calibri" w:cs="Calibri"/>
+          <w:sz w:val="24"/>
+          <w:szCs w:val="24"/>
+          <w:lang w:val="en-US"/>
+        </w:rPr>
+      </w:pPr>
+    </w:p>
+    <w:p>
+      <w:pPr>
+        <w:rPr>
+          <w:rFonts w:ascii="Calibri" w:hAnsi="Calibri" w:cs="Calibri"/>
+          <w:sz w:val="24"/>
+          <w:szCs w:val="24"/>
+          <w:lang w:val="en-US"/>
+        </w:rPr>
+      </w:pPr>
+    </w:p>
+    <w:p>
+      <w:pPr>
+        <w:rPr>
+          <w:rFonts w:ascii="Calibri" w:hAnsi="Calibri" w:cs="Calibri"/>
+          <w:sz w:val="24"/>
+          <w:szCs w:val="24"/>
+          <w:lang w:val="en-US"/>
+        </w:rPr>
+      </w:pPr>
+    </w:p>
+    <w:p>
+      <w:pPr>
+        <w:rPr>
+          <w:rFonts w:ascii="Calibri" w:hAnsi="Calibri" w:cs="Calibri"/>
+          <w:sz w:val="24"/>
+          <w:szCs w:val="24"/>
+          <w:lang w:val="en-US"/>
+        </w:rPr>
+      </w:pPr>
+    </w:p>
+    <w:p>
+      <w:pPr>
+        <w:rPr>
+          <w:rFonts w:ascii="Calibri" w:hAnsi="Calibri" w:cs="Calibri"/>
+          <w:sz w:val="24"/>
+          <w:szCs w:val="24"/>
+          <w:lang w:val="en-US"/>
+        </w:rPr>
+      </w:pPr>
+    </w:p>
+    <w:p>
+      <w:pPr>
+        <w:rPr>
+          <w:rFonts w:ascii="Calibri" w:hAnsi="Calibri" w:cs="Calibri"/>
+          <w:sz w:val="24"/>
+          <w:szCs w:val="24"/>
+          <w:lang w:val="en-US"/>
+        </w:rPr>
+      </w:pPr>
+    </w:p>
+    <w:p>
+      <w:pPr>
+        <w:rPr>
+          <w:rFonts w:ascii="Calibri" w:hAnsi="Calibri" w:cs="Calibri"/>
+          <w:sz w:val="24"/>
+          <w:szCs w:val="24"/>
+          <w:lang w:val="en-US"/>
+        </w:rPr>
+      </w:pPr>
+    </w:p>
+    <w:p>
+      <w:pPr>
+        <w:rPr>
+          <w:rFonts w:ascii="Calibri" w:hAnsi="Calibri" w:cs="Calibri"/>
+          <w:sz w:val="24"/>
+          <w:szCs w:val="24"/>
+          <w:lang w:val="en-US"/>
+        </w:rPr>
+      </w:pPr>
+    </w:p>
+    <w:p>
+      <w:pPr>
+        <w:rPr>
+          <w:rFonts w:ascii="Calibri" w:hAnsi="Calibri" w:cs="Calibri"/>
+          <w:sz w:val="24"/>
+          <w:szCs w:val="24"/>
+          <w:lang w:val="en-US"/>
+        </w:rPr>
+      </w:pPr>
+    </w:p>
+    <w:p>
+      <w:pPr>
+        <w:rPr>
+          <w:rFonts w:ascii="Calibri" w:hAnsi="Calibri" w:cs="Calibri"/>
+          <w:sz w:val="24"/>
+          <w:szCs w:val="24"/>
+        </w:rPr>
+      </w:pPr>
+      <w:r>
+        <w:rPr>
+          <w:rFonts w:ascii="Calibri" w:hAnsi="Calibri" w:cs="Calibri"/>
+          <w:sz w:val="24"/>
+          <w:szCs w:val="24"/>
+        </w:rPr>
+        <w:t xml:space="preserve">The About Us page for Pasticceria Papa introduces the bakery's history, values, and passion for baking. The page is designed with a sky-blue background and a clean, modern look. At the top, the navigation bar provides easy access to other sections of the website, including the home page, product </w:t>
+      </w:r>
+      <w:r>
+        <w:rPr>
+          <w:rFonts w:ascii="Calibri" w:hAnsi="Calibri" w:cs="Calibri"/>
+          <w:sz w:val="24"/>
+          <w:szCs w:val="24"/>
+        </w:rPr>
+        <w:t>catalogue</w:t>
+      </w:r>
+      <w:r>
+        <w:rPr>
+          <w:rFonts w:ascii="Calibri" w:hAnsi="Calibri" w:cs="Calibri"/>
+          <w:sz w:val="24"/>
+          <w:szCs w:val="24"/>
+        </w:rPr>
+        <w:t>, and contact page.</w:t>
+      </w:r>
+    </w:p>
+    <w:p>
+      <w:pPr>
+        <w:rPr>
+          <w:rFonts w:ascii="Calibri" w:hAnsi="Calibri" w:cs="Calibri"/>
+          <w:sz w:val="24"/>
+          <w:szCs w:val="24"/>
+        </w:rPr>
+      </w:pPr>
+      <w:r>
+        <w:rPr>
+          <w:rFonts w:ascii="Calibri" w:hAnsi="Calibri" w:cs="Calibri"/>
+          <w:sz w:val="24"/>
+          <w:szCs w:val="24"/>
+        </w:rPr>
+        <w:t>The content highlights the bakery’s journey, starting in 1985 as a family-owned business. It emphasizes the bakery’s commitment to quality, traditional Italian recipes, and its role in the community.</w:t>
+      </w:r>
+    </w:p>
+    <w:p>
+      <w:pPr>
+        <w:rPr>
+          <w:rFonts w:ascii="Calibri" w:hAnsi="Calibri" w:cs="Calibri"/>
+          <w:sz w:val="24"/>
+          <w:szCs w:val="24"/>
+        </w:rPr>
+      </w:pPr>
+      <w:r>
+        <w:rPr>
+          <w:rFonts w:ascii="Calibri" w:hAnsi="Calibri" w:cs="Calibri"/>
+          <w:sz w:val="24"/>
+          <w:szCs w:val="24"/>
+        </w:rPr>
+        <w:t>Users can learn about Pasticceria Papa’s mission to bring joy through delicious, lovingly made products. The page concludes with a simple footer, reinforcing that the bakery has been proudly serving its customers since its founding.</w:t>
+      </w:r>
+    </w:p>
+    <w:p>
+      <w:pPr>
+        <w:rPr>
+          <w:rFonts w:ascii="Calibri" w:hAnsi="Calibri" w:cs="Calibri"/>
+          <w:sz w:val="24"/>
+          <w:szCs w:val="24"/>
+          <w:lang w:val="en-US"/>
+        </w:rPr>
+      </w:pPr>
+    </w:p>
+    <w:p>
+      <w:pPr>
+        <w:rPr>
+          <w:rFonts w:ascii="Calibri" w:hAnsi="Calibri" w:cs="Calibri"/>
+          <w:sz w:val="24"/>
+          <w:szCs w:val="24"/>
+          <w:lang w:val="en-US"/>
+        </w:rPr>
+      </w:pPr>
+      <w:r>
+        <w:rPr>
+          <w:rFonts w:ascii="Calibri" w:hAnsi="Calibri" w:cs="Calibri"/>
+          <w:noProof/>
           <w:sz w:val="24"/>
           <w:szCs w:val="24"/>
           <w:lang w:val="en-US"/>
         </w:rPr>
         <w:drawing>
-          <wp:inline distT="0" distB="0" distL="0" distR="0" wp14:anchorId="5198F6E1" wp14:editId="753E5810">
-            <wp:extent cx="5731510" cy="2814955"/>
-            <wp:effectExtent l="0" t="0" r="2540" b="4445"/>
-            <wp:docPr id="1969017250" name="Picture 1" descr="A screenshot of a computer&#10;&#10;Description automatically generated"/>
+          <wp:inline distT="0" distB="0" distL="0" distR="0" wp14:anchorId="15BA8B78" wp14:editId="2053E83B">
+            <wp:extent cx="5731510" cy="2627630"/>
+            <wp:effectExtent l="0" t="0" r="2540" b="1270"/>
+            <wp:docPr id="1671383163" name="Picture 1" descr="A screenshot of a computer&#10;&#10;Description automatically generated"/>
             <wp:cNvGraphicFramePr>
               <a:graphicFrameLocks xmlns:a="http://schemas.openxmlformats.org/drawingml/2006/main" noChangeAspect="1"/>
             </wp:cNvGraphicFramePr>
@@ -1197,7 +1480,7 @@
               <a:graphicData uri="http://schemas.openxmlformats.org/drawingml/2006/picture">
                 <pic:pic xmlns:pic="http://schemas.openxmlformats.org/drawingml/2006/picture">
                   <pic:nvPicPr>
-                    <pic:cNvPr id="1969017250" name="Picture 1" descr="A screenshot of a computer&#10;&#10;Description automatically generated"/>
+                    <pic:cNvPr id="1671383163" name="Picture 1" descr="A screenshot of a computer&#10;&#10;Description automatically generated"/>
                     <pic:cNvPicPr/>
                   </pic:nvPicPr>
                   <pic:blipFill>
@@ -1209,7 +1492,7 @@
                   <pic:spPr>
                     <a:xfrm>
                       <a:off x="0" y="0"/>
-                      <a:ext cx="5731510" cy="2814955"/>
+                      <a:ext cx="5731510" cy="2627630"/>
                     </a:xfrm>
                     <a:prstGeom prst="rect">
                       <a:avLst/>
@@ -1221,19 +1504,222 @@
           </wp:inline>
         </w:drawing>
       </w:r>
-      <w:r>
-        <w:rPr>
-          <w:rFonts w:ascii="Calibri" w:hAnsi="Calibri" w:cs="Calibri"/>
-          <w:sz w:val="24"/>
-          <w:szCs w:val="24"/>
-          <w:lang w:val="en-US"/>
-        </w:rPr>
-        <w:lastRenderedPageBreak/>
+    </w:p>
+    <w:p>
+      <w:pPr>
+        <w:rPr>
+          <w:rFonts w:ascii="Calibri" w:hAnsi="Calibri" w:cs="Calibri"/>
+          <w:sz w:val="24"/>
+          <w:szCs w:val="24"/>
+          <w:lang w:val="en-US"/>
+        </w:rPr>
+      </w:pPr>
+    </w:p>
+    <w:p>
+      <w:pPr>
+        <w:rPr>
+          <w:rFonts w:ascii="Calibri" w:hAnsi="Calibri" w:cs="Calibri"/>
+          <w:sz w:val="24"/>
+          <w:szCs w:val="24"/>
+          <w:lang w:val="en-US"/>
+        </w:rPr>
+      </w:pPr>
+    </w:p>
+    <w:p>
+      <w:pPr>
+        <w:rPr>
+          <w:rFonts w:ascii="Calibri" w:hAnsi="Calibri" w:cs="Calibri"/>
+          <w:sz w:val="24"/>
+          <w:szCs w:val="24"/>
+          <w:lang w:val="en-US"/>
+        </w:rPr>
+      </w:pPr>
+    </w:p>
+    <w:p>
+      <w:pPr>
+        <w:rPr>
+          <w:rFonts w:ascii="Calibri" w:hAnsi="Calibri" w:cs="Calibri"/>
+          <w:sz w:val="24"/>
+          <w:szCs w:val="24"/>
+          <w:lang w:val="en-US"/>
+        </w:rPr>
+      </w:pPr>
+    </w:p>
+    <w:p>
+      <w:pPr>
+        <w:rPr>
+          <w:rFonts w:ascii="Calibri" w:hAnsi="Calibri" w:cs="Calibri"/>
+          <w:sz w:val="24"/>
+          <w:szCs w:val="24"/>
+          <w:lang w:val="en-US"/>
+        </w:rPr>
+      </w:pPr>
+    </w:p>
+    <w:p>
+      <w:pPr>
+        <w:rPr>
+          <w:rFonts w:ascii="Calibri" w:hAnsi="Calibri" w:cs="Calibri"/>
+          <w:sz w:val="24"/>
+          <w:szCs w:val="24"/>
+          <w:lang w:val="en-US"/>
+        </w:rPr>
+      </w:pPr>
+    </w:p>
+    <w:p>
+      <w:pPr>
+        <w:rPr>
+          <w:rFonts w:ascii="Calibri" w:hAnsi="Calibri" w:cs="Calibri"/>
+          <w:sz w:val="24"/>
+          <w:szCs w:val="24"/>
+          <w:lang w:val="en-US"/>
+        </w:rPr>
+      </w:pPr>
+    </w:p>
+    <w:p>
+      <w:pPr>
+        <w:rPr>
+          <w:rFonts w:ascii="Calibri" w:hAnsi="Calibri" w:cs="Calibri"/>
+          <w:sz w:val="24"/>
+          <w:szCs w:val="24"/>
+          <w:lang w:val="en-US"/>
+        </w:rPr>
+      </w:pPr>
+    </w:p>
+    <w:p>
+      <w:pPr>
+        <w:rPr>
+          <w:rFonts w:ascii="Calibri" w:hAnsi="Calibri" w:cs="Calibri"/>
+          <w:sz w:val="24"/>
+          <w:szCs w:val="24"/>
+          <w:lang w:val="en-US"/>
+        </w:rPr>
+      </w:pPr>
+    </w:p>
+    <w:p>
+      <w:pPr>
+        <w:rPr>
+          <w:rFonts w:ascii="Calibri" w:hAnsi="Calibri" w:cs="Calibri"/>
+          <w:sz w:val="24"/>
+          <w:szCs w:val="24"/>
+          <w:lang w:val="en-US"/>
+        </w:rPr>
+      </w:pPr>
+    </w:p>
+    <w:p>
+      <w:pPr>
+        <w:rPr>
+          <w:rFonts w:ascii="Calibri" w:hAnsi="Calibri" w:cs="Calibri"/>
+          <w:sz w:val="24"/>
+          <w:szCs w:val="24"/>
+          <w:lang w:val="en-US"/>
+        </w:rPr>
+      </w:pPr>
+    </w:p>
+    <w:p>
+      <w:pPr>
+        <w:rPr>
+          <w:rFonts w:ascii="Calibri" w:hAnsi="Calibri" w:cs="Calibri"/>
+          <w:sz w:val="24"/>
+          <w:szCs w:val="24"/>
+        </w:rPr>
+      </w:pPr>
+      <w:r>
+        <w:rPr>
+          <w:rFonts w:ascii="Calibri" w:hAnsi="Calibri" w:cs="Calibri"/>
+          <w:sz w:val="24"/>
+          <w:szCs w:val="24"/>
+        </w:rPr>
+        <w:t xml:space="preserve">The Contact Us page for Pasticceria Papa provides a friendly and easy way for customers to get in touch. The page features a warm orange background with a clean, professional look. At the top, the navigation bar allows users to navigate to other sections like the home page, about us, </w:t>
+      </w:r>
+      <w:r>
+        <w:rPr>
+          <w:rFonts w:ascii="Calibri" w:hAnsi="Calibri" w:cs="Calibri"/>
+          <w:sz w:val="24"/>
+          <w:szCs w:val="24"/>
+        </w:rPr>
+        <w:t>catalogue</w:t>
+      </w:r>
+      <w:r>
+        <w:rPr>
+          <w:rFonts w:ascii="Calibri" w:hAnsi="Calibri" w:cs="Calibri"/>
+          <w:sz w:val="24"/>
+          <w:szCs w:val="24"/>
+        </w:rPr>
+        <w:t>, and shopping cart.</w:t>
+      </w:r>
+    </w:p>
+    <w:p>
+      <w:pPr>
+        <w:rPr>
+          <w:rFonts w:ascii="Calibri" w:hAnsi="Calibri" w:cs="Calibri"/>
+          <w:sz w:val="24"/>
+          <w:szCs w:val="24"/>
+        </w:rPr>
+      </w:pPr>
+      <w:r>
+        <w:rPr>
+          <w:rFonts w:ascii="Calibri" w:hAnsi="Calibri" w:cs="Calibri"/>
+          <w:sz w:val="24"/>
+          <w:szCs w:val="24"/>
+        </w:rPr>
+        <w:t>The page has two main sections: a contact form and location details. In the form, users can submit their name, email, and message directly to the bakery. On the right, there’s information about Pasticceria Papa’s location, phone number, and email address.</w:t>
+      </w:r>
+    </w:p>
+    <w:p>
+      <w:pPr>
+        <w:rPr>
+          <w:rFonts w:ascii="Calibri" w:hAnsi="Calibri" w:cs="Calibri"/>
+          <w:sz w:val="24"/>
+          <w:szCs w:val="24"/>
+        </w:rPr>
+      </w:pPr>
+      <w:r>
+        <w:rPr>
+          <w:rFonts w:ascii="Calibri" w:hAnsi="Calibri" w:cs="Calibri"/>
+          <w:sz w:val="24"/>
+          <w:szCs w:val="24"/>
+        </w:rPr>
+        <w:t xml:space="preserve">The design is user-friendly, with a blue and white </w:t>
+      </w:r>
+      <w:r>
+        <w:rPr>
+          <w:rFonts w:ascii="Calibri" w:hAnsi="Calibri" w:cs="Calibri"/>
+          <w:sz w:val="24"/>
+          <w:szCs w:val="24"/>
+        </w:rPr>
+        <w:t>colour</w:t>
+      </w:r>
+      <w:r>
+        <w:rPr>
+          <w:rFonts w:ascii="Calibri" w:hAnsi="Calibri" w:cs="Calibri"/>
+          <w:sz w:val="24"/>
+          <w:szCs w:val="24"/>
+        </w:rPr>
+        <w:t xml:space="preserve"> scheme that makes the content easy to read, and the contact form simple to fill out.</w:t>
+      </w:r>
+    </w:p>
+    <w:p>
+      <w:pPr>
+        <w:rPr>
+          <w:rFonts w:ascii="Calibri" w:hAnsi="Calibri" w:cs="Calibri"/>
+          <w:sz w:val="24"/>
+          <w:szCs w:val="24"/>
+          <w:lang w:val="en-US"/>
+        </w:rPr>
+      </w:pPr>
+      <w:r>
+        <w:rPr>
+          <w:rFonts w:ascii="Calibri" w:hAnsi="Calibri" w:cs="Calibri"/>
+          <w:noProof/>
+          <w:sz w:val="24"/>
+          <w:szCs w:val="24"/>
+          <w:lang w:val="en-US"/>
+        </w:rPr>
         <w:drawing>
-          <wp:inline distT="0" distB="0" distL="0" distR="0" wp14:anchorId="35320705" wp14:editId="4E946CEB">
-            <wp:extent cx="5731510" cy="2686685"/>
+          <wp:inline distT="0" distB="0" distL="0" distR="0" wp14:anchorId="2D043F39" wp14:editId="46CC385E">
+            <wp:extent cx="5731510" cy="2615565"/>
             <wp:effectExtent l="0" t="0" r="2540" b="0"/>
-            <wp:docPr id="274837918" name="Picture 1" descr="A screenshot of a computer&#10;&#10;Description automatically generated"/>
+            <wp:docPr id="255386218" name="Picture 1" descr="A screenshot of a contact us&#10;&#10;Description automatically generated"/>
             <wp:cNvGraphicFramePr>
               <a:graphicFrameLocks xmlns:a="http://schemas.openxmlformats.org/drawingml/2006/main" noChangeAspect="1"/>
             </wp:cNvGraphicFramePr>
@@ -1241,7 +1727,7 @@
               <a:graphicData uri="http://schemas.openxmlformats.org/drawingml/2006/picture">
                 <pic:pic xmlns:pic="http://schemas.openxmlformats.org/drawingml/2006/picture">
                   <pic:nvPicPr>
-                    <pic:cNvPr id="274837918" name="Picture 1" descr="A screenshot of a computer&#10;&#10;Description automatically generated"/>
+                    <pic:cNvPr id="255386218" name="Picture 1" descr="A screenshot of a contact us&#10;&#10;Description automatically generated"/>
                     <pic:cNvPicPr/>
                   </pic:nvPicPr>
                   <pic:blipFill>
@@ -1253,7 +1739,7 @@
                   <pic:spPr>
                     <a:xfrm>
                       <a:off x="0" y="0"/>
-                      <a:ext cx="5731510" cy="2686685"/>
+                      <a:ext cx="5731510" cy="2615565"/>
                     </a:xfrm>
                     <a:prstGeom prst="rect">
                       <a:avLst/>
@@ -1265,18 +1751,226 @@
           </wp:inline>
         </w:drawing>
       </w:r>
-      <w:r>
-        <w:rPr>
-          <w:rFonts w:ascii="Calibri" w:hAnsi="Calibri" w:cs="Calibri"/>
+    </w:p>
+    <w:p>
+      <w:pPr>
+        <w:rPr>
+          <w:rFonts w:ascii="Calibri" w:hAnsi="Calibri" w:cs="Calibri"/>
+          <w:sz w:val="24"/>
+          <w:szCs w:val="24"/>
+          <w:lang w:val="en-US"/>
+        </w:rPr>
+      </w:pPr>
+    </w:p>
+    <w:p>
+      <w:pPr>
+        <w:rPr>
+          <w:rFonts w:ascii="Calibri" w:hAnsi="Calibri" w:cs="Calibri"/>
+          <w:sz w:val="24"/>
+          <w:szCs w:val="24"/>
+          <w:lang w:val="en-US"/>
+        </w:rPr>
+      </w:pPr>
+    </w:p>
+    <w:p>
+      <w:pPr>
+        <w:rPr>
+          <w:rFonts w:ascii="Calibri" w:hAnsi="Calibri" w:cs="Calibri"/>
+          <w:sz w:val="24"/>
+          <w:szCs w:val="24"/>
+          <w:lang w:val="en-US"/>
+        </w:rPr>
+      </w:pPr>
+    </w:p>
+    <w:p>
+      <w:pPr>
+        <w:rPr>
+          <w:rFonts w:ascii="Calibri" w:hAnsi="Calibri" w:cs="Calibri"/>
+          <w:sz w:val="24"/>
+          <w:szCs w:val="24"/>
+          <w:lang w:val="en-US"/>
+        </w:rPr>
+      </w:pPr>
+    </w:p>
+    <w:p>
+      <w:pPr>
+        <w:rPr>
+          <w:rFonts w:ascii="Calibri" w:hAnsi="Calibri" w:cs="Calibri"/>
+          <w:sz w:val="24"/>
+          <w:szCs w:val="24"/>
+          <w:lang w:val="en-US"/>
+        </w:rPr>
+      </w:pPr>
+    </w:p>
+    <w:p>
+      <w:pPr>
+        <w:rPr>
+          <w:rFonts w:ascii="Calibri" w:hAnsi="Calibri" w:cs="Calibri"/>
+          <w:sz w:val="24"/>
+          <w:szCs w:val="24"/>
+          <w:lang w:val="en-US"/>
+        </w:rPr>
+      </w:pPr>
+    </w:p>
+    <w:p>
+      <w:pPr>
+        <w:rPr>
+          <w:rFonts w:ascii="Calibri" w:hAnsi="Calibri" w:cs="Calibri"/>
+          <w:sz w:val="24"/>
+          <w:szCs w:val="24"/>
+          <w:lang w:val="en-US"/>
+        </w:rPr>
+      </w:pPr>
+    </w:p>
+    <w:p>
+      <w:pPr>
+        <w:rPr>
+          <w:rFonts w:ascii="Calibri" w:hAnsi="Calibri" w:cs="Calibri"/>
+          <w:sz w:val="24"/>
+          <w:szCs w:val="24"/>
+          <w:lang w:val="en-US"/>
+        </w:rPr>
+      </w:pPr>
+    </w:p>
+    <w:p>
+      <w:pPr>
+        <w:rPr>
+          <w:rFonts w:ascii="Calibri" w:hAnsi="Calibri" w:cs="Calibri"/>
+          <w:sz w:val="24"/>
+          <w:szCs w:val="24"/>
+          <w:lang w:val="en-US"/>
+        </w:rPr>
+      </w:pPr>
+    </w:p>
+    <w:p>
+      <w:pPr>
+        <w:rPr>
+          <w:rFonts w:ascii="Calibri" w:hAnsi="Calibri" w:cs="Calibri"/>
+          <w:sz w:val="24"/>
+          <w:szCs w:val="24"/>
+          <w:lang w:val="en-US"/>
+        </w:rPr>
+      </w:pPr>
+    </w:p>
+    <w:p>
+      <w:pPr>
+        <w:rPr>
+          <w:rFonts w:ascii="Calibri" w:hAnsi="Calibri" w:cs="Calibri"/>
+          <w:sz w:val="24"/>
+          <w:szCs w:val="24"/>
+          <w:lang w:val="en-US"/>
+        </w:rPr>
+      </w:pPr>
+    </w:p>
+    <w:p>
+      <w:pPr>
+        <w:rPr>
+          <w:rFonts w:ascii="Calibri" w:hAnsi="Calibri" w:cs="Calibri"/>
+          <w:sz w:val="24"/>
+          <w:szCs w:val="24"/>
+          <w:lang w:val="en-US"/>
+        </w:rPr>
+      </w:pPr>
+    </w:p>
+    <w:p>
+      <w:pPr>
+        <w:rPr>
+          <w:rFonts w:ascii="Calibri" w:hAnsi="Calibri" w:cs="Calibri"/>
+          <w:sz w:val="24"/>
+          <w:szCs w:val="24"/>
+          <w:lang w:val="en-US"/>
+        </w:rPr>
+      </w:pPr>
+    </w:p>
+    <w:p>
+      <w:pPr>
+        <w:rPr>
+          <w:rFonts w:ascii="Calibri" w:hAnsi="Calibri" w:cs="Calibri"/>
+          <w:sz w:val="24"/>
+          <w:szCs w:val="24"/>
+          <w:lang w:val="en-US"/>
+        </w:rPr>
+      </w:pPr>
+      <w:r>
+        <w:rPr>
+          <w:rFonts w:ascii="Calibri" w:hAnsi="Calibri" w:cs="Calibri"/>
+          <w:sz w:val="24"/>
+          <w:szCs w:val="24"/>
+          <w:lang w:val="en-US"/>
+        </w:rPr>
+        <w:t>Welcome to the Product References page of Pasticceria Papa! Here, you’ll find a curated list of links showcasing our delicious offerings, complete with images to tantalize your taste buds. Each item is accompanied by a direct link to its image, allowing you to explore our treats visually and virtually.</w:t>
+      </w:r>
+    </w:p>
+    <w:p>
+      <w:pPr>
+        <w:rPr>
+          <w:rFonts w:ascii="Calibri" w:hAnsi="Calibri" w:cs="Calibri"/>
+          <w:sz w:val="24"/>
+          <w:szCs w:val="24"/>
+          <w:lang w:val="en-US"/>
+        </w:rPr>
+      </w:pPr>
+      <w:r>
+        <w:rPr>
+          <w:rFonts w:ascii="Calibri" w:hAnsi="Calibri" w:cs="Calibri"/>
+          <w:sz w:val="24"/>
+          <w:szCs w:val="24"/>
+          <w:lang w:val="en-US"/>
+        </w:rPr>
+        <w:t xml:space="preserve">Whether it’s our flaky Plain Croissant, indulgent Nutella Bombe Donut, or rich </w:t>
+      </w:r>
+      <w:r>
+        <w:rPr>
+          <w:rFonts w:ascii="Calibri" w:hAnsi="Calibri" w:cs="Calibri"/>
+          <w:sz w:val="24"/>
+          <w:szCs w:val="24"/>
+          <w:lang w:val="en-US"/>
+        </w:rPr>
+        <w:t>Cheesecake</w:t>
+      </w:r>
+      <w:r>
+        <w:rPr>
+          <w:rFonts w:ascii="Calibri" w:hAnsi="Calibri" w:cs="Calibri"/>
+          <w:sz w:val="24"/>
+          <w:szCs w:val="24"/>
+          <w:lang w:val="en-US"/>
+        </w:rPr>
+        <w:t>, you can easily access more details about each product. All references are up to date and can be accessed with just a click. We hope this page enhances your shopping experience and helps you discover all the delightful pastries we have to offer. Enjoy your browsing!</w:t>
+      </w:r>
+    </w:p>
+    <w:p>
+      <w:pPr>
+        <w:rPr>
+          <w:rFonts w:ascii="Calibri" w:hAnsi="Calibri" w:cs="Calibri"/>
+          <w:noProof/>
+          <w:sz w:val="24"/>
+          <w:szCs w:val="24"/>
+          <w:lang w:val="en-US"/>
+        </w:rPr>
+      </w:pPr>
+    </w:p>
+    <w:p>
+      <w:pPr>
+        <w:rPr>
+          <w:rFonts w:ascii="Calibri" w:hAnsi="Calibri" w:cs="Calibri"/>
+          <w:sz w:val="24"/>
+          <w:szCs w:val="24"/>
+          <w:lang w:val="en-US"/>
+        </w:rPr>
+      </w:pPr>
+      <w:r>
+        <w:rPr>
+          <w:rFonts w:ascii="Calibri" w:hAnsi="Calibri" w:cs="Calibri"/>
+          <w:noProof/>
           <w:sz w:val="24"/>
           <w:szCs w:val="24"/>
           <w:lang w:val="en-US"/>
         </w:rPr>
         <w:drawing>
-          <wp:inline distT="0" distB="0" distL="0" distR="0" wp14:anchorId="29CF8139" wp14:editId="76F2C08A">
-            <wp:extent cx="5731510" cy="2644775"/>
-            <wp:effectExtent l="0" t="0" r="2540" b="3175"/>
-            <wp:docPr id="239852344" name="Picture 1" descr="A screenshot of a website&#10;&#10;Description automatically generated"/>
+          <wp:inline distT="0" distB="0" distL="0" distR="0" wp14:anchorId="6EB2859A" wp14:editId="604379FE">
+            <wp:extent cx="5731510" cy="2620645"/>
+            <wp:effectExtent l="0" t="0" r="2540" b="8255"/>
+            <wp:docPr id="1294685388" name="Picture 1" descr="A screenshot of a computer&#10;&#10;Description automatically generated"/>
             <wp:cNvGraphicFramePr>
               <a:graphicFrameLocks xmlns:a="http://schemas.openxmlformats.org/drawingml/2006/main" noChangeAspect="1"/>
             </wp:cNvGraphicFramePr>
@@ -1284,98 +1978,11 @@
               <a:graphicData uri="http://schemas.openxmlformats.org/drawingml/2006/picture">
                 <pic:pic xmlns:pic="http://schemas.openxmlformats.org/drawingml/2006/picture">
                   <pic:nvPicPr>
-                    <pic:cNvPr id="239852344" name="Picture 1" descr="A screenshot of a website&#10;&#10;Description automatically generated"/>
+                    <pic:cNvPr id="1294685388" name="Picture 1" descr="A screenshot of a computer&#10;&#10;Description automatically generated"/>
                     <pic:cNvPicPr/>
                   </pic:nvPicPr>
                   <pic:blipFill>
                     <a:blip r:embed="rId9"/>
-                    <a:stretch>
-                      <a:fillRect/>
-                    </a:stretch>
-                  </pic:blipFill>
-                  <pic:spPr>
-                    <a:xfrm>
-                      <a:off x="0" y="0"/>
-                      <a:ext cx="5731510" cy="2644775"/>
-                    </a:xfrm>
-                    <a:prstGeom prst="rect">
-                      <a:avLst/>
-                    </a:prstGeom>
-                  </pic:spPr>
-                </pic:pic>
-              </a:graphicData>
-            </a:graphic>
-          </wp:inline>
-        </w:drawing>
-      </w:r>
-      <w:r>
-        <w:rPr>
-          <w:rFonts w:ascii="Calibri" w:hAnsi="Calibri" w:cs="Calibri"/>
-          <w:sz w:val="24"/>
-          <w:szCs w:val="24"/>
-          <w:lang w:val="en-US"/>
-        </w:rPr>
-        <w:drawing>
-          <wp:inline distT="0" distB="0" distL="0" distR="0" wp14:anchorId="49C5331B" wp14:editId="718B91F3">
-            <wp:extent cx="5731510" cy="2554605"/>
-            <wp:effectExtent l="0" t="0" r="2540" b="0"/>
-            <wp:docPr id="16881406" name="Picture 1" descr="A screenshot of a computer&#10;&#10;Description automatically generated"/>
-            <wp:cNvGraphicFramePr>
-              <a:graphicFrameLocks xmlns:a="http://schemas.openxmlformats.org/drawingml/2006/main" noChangeAspect="1"/>
-            </wp:cNvGraphicFramePr>
-            <a:graphic xmlns:a="http://schemas.openxmlformats.org/drawingml/2006/main">
-              <a:graphicData uri="http://schemas.openxmlformats.org/drawingml/2006/picture">
-                <pic:pic xmlns:pic="http://schemas.openxmlformats.org/drawingml/2006/picture">
-                  <pic:nvPicPr>
-                    <pic:cNvPr id="16881406" name="Picture 1" descr="A screenshot of a computer&#10;&#10;Description automatically generated"/>
-                    <pic:cNvPicPr/>
-                  </pic:nvPicPr>
-                  <pic:blipFill>
-                    <a:blip r:embed="rId10"/>
-                    <a:stretch>
-                      <a:fillRect/>
-                    </a:stretch>
-                  </pic:blipFill>
-                  <pic:spPr>
-                    <a:xfrm>
-                      <a:off x="0" y="0"/>
-                      <a:ext cx="5731510" cy="2554605"/>
-                    </a:xfrm>
-                    <a:prstGeom prst="rect">
-                      <a:avLst/>
-                    </a:prstGeom>
-                  </pic:spPr>
-                </pic:pic>
-              </a:graphicData>
-            </a:graphic>
-          </wp:inline>
-        </w:drawing>
-      </w:r>
-      <w:r>
-        <w:rPr>
-          <w:rFonts w:ascii="Calibri" w:hAnsi="Calibri" w:cs="Calibri"/>
-          <w:sz w:val="24"/>
-          <w:szCs w:val="24"/>
-          <w:lang w:val="en-US"/>
-        </w:rPr>
-        <w:lastRenderedPageBreak/>
-        <w:drawing>
-          <wp:inline distT="0" distB="0" distL="0" distR="0" wp14:anchorId="63C68480" wp14:editId="39DAD16C">
-            <wp:extent cx="5731510" cy="2620645"/>
-            <wp:effectExtent l="0" t="0" r="2540" b="8255"/>
-            <wp:docPr id="1071061793" name="Picture 1" descr="A screenshot of a computer&#10;&#10;Description automatically generated"/>
-            <wp:cNvGraphicFramePr>
-              <a:graphicFrameLocks xmlns:a="http://schemas.openxmlformats.org/drawingml/2006/main" noChangeAspect="1"/>
-            </wp:cNvGraphicFramePr>
-            <a:graphic xmlns:a="http://schemas.openxmlformats.org/drawingml/2006/main">
-              <a:graphicData uri="http://schemas.openxmlformats.org/drawingml/2006/picture">
-                <pic:pic xmlns:pic="http://schemas.openxmlformats.org/drawingml/2006/picture">
-                  <pic:nvPicPr>
-                    <pic:cNvPr id="1071061793" name="Picture 1" descr="A screenshot of a computer&#10;&#10;Description automatically generated"/>
-                    <pic:cNvPicPr/>
-                  </pic:nvPicPr>
-                  <pic:blipFill>
-                    <a:blip r:embed="rId11"/>
                     <a:stretch>
                       <a:fillRect/>
                     </a:stretch>
@@ -1395,18 +2002,206 @@
           </wp:inline>
         </w:drawing>
       </w:r>
-      <w:r>
-        <w:rPr>
-          <w:rFonts w:ascii="Calibri" w:hAnsi="Calibri" w:cs="Calibri"/>
-          <w:sz w:val="24"/>
-          <w:szCs w:val="24"/>
-          <w:lang w:val="en-US"/>
-        </w:rPr>
+    </w:p>
+    <w:p>
+      <w:pPr>
+        <w:rPr>
+          <w:rFonts w:ascii="Calibri" w:hAnsi="Calibri" w:cs="Calibri"/>
+          <w:sz w:val="24"/>
+          <w:szCs w:val="24"/>
+          <w:lang w:val="en-US"/>
+        </w:rPr>
+      </w:pPr>
+    </w:p>
+    <w:p>
+      <w:pPr>
+        <w:rPr>
+          <w:rFonts w:ascii="Calibri" w:hAnsi="Calibri" w:cs="Calibri"/>
+          <w:sz w:val="24"/>
+          <w:szCs w:val="24"/>
+          <w:lang w:val="en-US"/>
+        </w:rPr>
+      </w:pPr>
+    </w:p>
+    <w:p>
+      <w:pPr>
+        <w:rPr>
+          <w:rFonts w:ascii="Calibri" w:hAnsi="Calibri" w:cs="Calibri"/>
+          <w:sz w:val="24"/>
+          <w:szCs w:val="24"/>
+          <w:lang w:val="en-US"/>
+        </w:rPr>
+      </w:pPr>
+    </w:p>
+    <w:p>
+      <w:pPr>
+        <w:rPr>
+          <w:rFonts w:ascii="Calibri" w:hAnsi="Calibri" w:cs="Calibri"/>
+          <w:sz w:val="24"/>
+          <w:szCs w:val="24"/>
+          <w:lang w:val="en-US"/>
+        </w:rPr>
+      </w:pPr>
+    </w:p>
+    <w:p>
+      <w:pPr>
+        <w:rPr>
+          <w:rFonts w:ascii="Calibri" w:hAnsi="Calibri" w:cs="Calibri"/>
+          <w:sz w:val="24"/>
+          <w:szCs w:val="24"/>
+          <w:lang w:val="en-US"/>
+        </w:rPr>
+      </w:pPr>
+    </w:p>
+    <w:p>
+      <w:pPr>
+        <w:rPr>
+          <w:rFonts w:ascii="Calibri" w:hAnsi="Calibri" w:cs="Calibri"/>
+          <w:sz w:val="24"/>
+          <w:szCs w:val="24"/>
+          <w:lang w:val="en-US"/>
+        </w:rPr>
+      </w:pPr>
+    </w:p>
+    <w:p>
+      <w:pPr>
+        <w:rPr>
+          <w:rFonts w:ascii="Calibri" w:hAnsi="Calibri" w:cs="Calibri"/>
+          <w:sz w:val="24"/>
+          <w:szCs w:val="24"/>
+          <w:lang w:val="en-US"/>
+        </w:rPr>
+      </w:pPr>
+    </w:p>
+    <w:p>
+      <w:pPr>
+        <w:rPr>
+          <w:rFonts w:ascii="Calibri" w:hAnsi="Calibri" w:cs="Calibri"/>
+          <w:sz w:val="24"/>
+          <w:szCs w:val="24"/>
+          <w:lang w:val="en-US"/>
+        </w:rPr>
+      </w:pPr>
+    </w:p>
+    <w:p>
+      <w:pPr>
+        <w:rPr>
+          <w:rFonts w:ascii="Calibri" w:hAnsi="Calibri" w:cs="Calibri"/>
+          <w:sz w:val="24"/>
+          <w:szCs w:val="24"/>
+          <w:lang w:val="en-US"/>
+        </w:rPr>
+      </w:pPr>
+    </w:p>
+    <w:p>
+      <w:pPr>
+        <w:rPr>
+          <w:rFonts w:ascii="Calibri" w:hAnsi="Calibri" w:cs="Calibri"/>
+          <w:sz w:val="24"/>
+          <w:szCs w:val="24"/>
+          <w:lang w:val="en-US"/>
+        </w:rPr>
+      </w:pPr>
+    </w:p>
+    <w:p>
+      <w:pPr>
+        <w:rPr>
+          <w:rFonts w:ascii="Calibri" w:hAnsi="Calibri" w:cs="Calibri"/>
+          <w:sz w:val="24"/>
+          <w:szCs w:val="24"/>
+          <w:lang w:val="en-US"/>
+        </w:rPr>
+      </w:pPr>
+    </w:p>
+    <w:p>
+      <w:pPr>
+        <w:rPr>
+          <w:rFonts w:ascii="Calibri" w:hAnsi="Calibri" w:cs="Calibri"/>
+          <w:sz w:val="24"/>
+          <w:szCs w:val="24"/>
+          <w:lang w:val="en-US"/>
+        </w:rPr>
+      </w:pPr>
+    </w:p>
+    <w:p>
+      <w:pPr>
+        <w:rPr>
+          <w:rFonts w:ascii="Calibri" w:hAnsi="Calibri" w:cs="Calibri"/>
+          <w:sz w:val="24"/>
+          <w:szCs w:val="24"/>
+          <w:lang w:val="en-US"/>
+        </w:rPr>
+      </w:pPr>
+      <w:r>
+        <w:rPr>
+          <w:rFonts w:ascii="Calibri" w:hAnsi="Calibri" w:cs="Calibri"/>
+          <w:sz w:val="24"/>
+          <w:szCs w:val="24"/>
+          <w:lang w:val="en-US"/>
+        </w:rPr>
+        <w:t xml:space="preserve">Welcome to the Pastry </w:t>
+      </w:r>
+      <w:r>
+        <w:rPr>
+          <w:rFonts w:ascii="Calibri" w:hAnsi="Calibri" w:cs="Calibri"/>
+          <w:sz w:val="24"/>
+          <w:szCs w:val="24"/>
+          <w:lang w:val="en-US"/>
+        </w:rPr>
+        <w:t>Items (</w:t>
+      </w:r>
+      <w:r>
+        <w:rPr>
+          <w:rFonts w:ascii="Calibri" w:hAnsi="Calibri" w:cs="Calibri"/>
+          <w:sz w:val="24"/>
+          <w:szCs w:val="24"/>
+          <w:lang w:val="en-US"/>
+        </w:rPr>
+        <w:t>Catalogue) page of Pasticceria Papa, where delightful treats await you! Here, you can explore our mouthwatering selection of pastries, each beautifully displayed in a grid format. Every product card showcases a tempting image, along with its name, description, price, and category.</w:t>
+      </w:r>
+    </w:p>
+    <w:p>
+      <w:pPr>
+        <w:rPr>
+          <w:rFonts w:ascii="Calibri" w:hAnsi="Calibri" w:cs="Calibri"/>
+          <w:sz w:val="24"/>
+          <w:szCs w:val="24"/>
+          <w:lang w:val="en-US"/>
+        </w:rPr>
+      </w:pPr>
+      <w:r>
+        <w:rPr>
+          <w:rFonts w:ascii="Calibri" w:hAnsi="Calibri" w:cs="Calibri"/>
+          <w:sz w:val="24"/>
+          <w:szCs w:val="24"/>
+          <w:lang w:val="en-US"/>
+        </w:rPr>
+        <w:t>Navigating through our offerings is a breeze, thanks to our user-friendly layout. You can easily filter your search by categories like Cake, Pastry, Bread, and Biscuit. When you find something that catches your eye, simply click on the “See Details of the Product” button for more information. Immerse yourself in our delightful pastry selection and discover your new favorite treat today at Pasticceria Papa!</w:t>
+      </w:r>
+    </w:p>
+    <w:p>
+      <w:pPr>
+        <w:rPr>
+          <w:rFonts w:ascii="Calibri" w:hAnsi="Calibri" w:cs="Calibri"/>
+          <w:sz w:val="24"/>
+          <w:szCs w:val="24"/>
+          <w:lang w:val="en-US"/>
+        </w:rPr>
+      </w:pPr>
+      <w:r>
+        <w:rPr>
+          <w:rFonts w:ascii="Calibri" w:hAnsi="Calibri" w:cs="Calibri"/>
+          <w:noProof/>
+          <w:sz w:val="24"/>
+          <w:szCs w:val="24"/>
+          <w:lang w:val="en-US"/>
+        </w:rPr>
+        <w:lastRenderedPageBreak/>
         <w:drawing>
-          <wp:inline distT="0" distB="0" distL="0" distR="0" wp14:anchorId="39122849" wp14:editId="2CC2206E">
-            <wp:extent cx="5731510" cy="2644775"/>
-            <wp:effectExtent l="0" t="0" r="2540" b="3175"/>
-            <wp:docPr id="1872898915" name="Picture 1" descr="A screenshot of a computer&#10;&#10;Description automatically generated"/>
+          <wp:inline distT="0" distB="0" distL="0" distR="0" wp14:anchorId="34E5043A" wp14:editId="01A0EB9F">
+            <wp:extent cx="5731510" cy="2590800"/>
+            <wp:effectExtent l="0" t="0" r="2540" b="0"/>
+            <wp:docPr id="1467034821" name="Picture 1" descr="A screenshot of a website&#10;&#10;Description automatically generated"/>
             <wp:cNvGraphicFramePr>
               <a:graphicFrameLocks xmlns:a="http://schemas.openxmlformats.org/drawingml/2006/main" noChangeAspect="1"/>
             </wp:cNvGraphicFramePr>
@@ -1414,7 +2209,203 @@
               <a:graphicData uri="http://schemas.openxmlformats.org/drawingml/2006/picture">
                 <pic:pic xmlns:pic="http://schemas.openxmlformats.org/drawingml/2006/picture">
                   <pic:nvPicPr>
-                    <pic:cNvPr id="1872898915" name="Picture 1" descr="A screenshot of a computer&#10;&#10;Description automatically generated"/>
+                    <pic:cNvPr id="1467034821" name="Picture 1" descr="A screenshot of a website&#10;&#10;Description automatically generated"/>
+                    <pic:cNvPicPr/>
+                  </pic:nvPicPr>
+                  <pic:blipFill>
+                    <a:blip r:embed="rId10"/>
+                    <a:stretch>
+                      <a:fillRect/>
+                    </a:stretch>
+                  </pic:blipFill>
+                  <pic:spPr>
+                    <a:xfrm>
+                      <a:off x="0" y="0"/>
+                      <a:ext cx="5731510" cy="2590800"/>
+                    </a:xfrm>
+                    <a:prstGeom prst="rect">
+                      <a:avLst/>
+                    </a:prstGeom>
+                  </pic:spPr>
+                </pic:pic>
+              </a:graphicData>
+            </a:graphic>
+          </wp:inline>
+        </w:drawing>
+      </w:r>
+      <w:r>
+        <w:rPr>
+          <w:rFonts w:ascii="Calibri" w:hAnsi="Calibri" w:cs="Calibri"/>
+          <w:noProof/>
+          <w:sz w:val="24"/>
+          <w:szCs w:val="24"/>
+          <w:lang w:val="en-US"/>
+        </w:rPr>
+        <w:drawing>
+          <wp:inline distT="0" distB="0" distL="0" distR="0" wp14:anchorId="66975DD8" wp14:editId="65159415">
+            <wp:extent cx="5731510" cy="2647950"/>
+            <wp:effectExtent l="0" t="0" r="2540" b="0"/>
+            <wp:docPr id="1305241604" name="Picture 1" descr="A screenshot of a food website&#10;&#10;Description automatically generated"/>
+            <wp:cNvGraphicFramePr>
+              <a:graphicFrameLocks xmlns:a="http://schemas.openxmlformats.org/drawingml/2006/main" noChangeAspect="1"/>
+            </wp:cNvGraphicFramePr>
+            <a:graphic xmlns:a="http://schemas.openxmlformats.org/drawingml/2006/main">
+              <a:graphicData uri="http://schemas.openxmlformats.org/drawingml/2006/picture">
+                <pic:pic xmlns:pic="http://schemas.openxmlformats.org/drawingml/2006/picture">
+                  <pic:nvPicPr>
+                    <pic:cNvPr id="1305241604" name="Picture 1" descr="A screenshot of a food website&#10;&#10;Description automatically generated"/>
+                    <pic:cNvPicPr/>
+                  </pic:nvPicPr>
+                  <pic:blipFill>
+                    <a:blip r:embed="rId11"/>
+                    <a:stretch>
+                      <a:fillRect/>
+                    </a:stretch>
+                  </pic:blipFill>
+                  <pic:spPr>
+                    <a:xfrm>
+                      <a:off x="0" y="0"/>
+                      <a:ext cx="5731510" cy="2647950"/>
+                    </a:xfrm>
+                    <a:prstGeom prst="rect">
+                      <a:avLst/>
+                    </a:prstGeom>
+                  </pic:spPr>
+                </pic:pic>
+              </a:graphicData>
+            </a:graphic>
+          </wp:inline>
+        </w:drawing>
+      </w:r>
+    </w:p>
+    <w:p>
+      <w:pPr>
+        <w:rPr>
+          <w:rFonts w:ascii="Calibri" w:hAnsi="Calibri" w:cs="Calibri"/>
+          <w:sz w:val="24"/>
+          <w:szCs w:val="24"/>
+          <w:lang w:val="en-US"/>
+        </w:rPr>
+      </w:pPr>
+    </w:p>
+    <w:p>
+      <w:pPr>
+        <w:rPr>
+          <w:rFonts w:ascii="Calibri" w:hAnsi="Calibri" w:cs="Calibri"/>
+          <w:sz w:val="24"/>
+          <w:szCs w:val="24"/>
+          <w:lang w:val="en-US"/>
+        </w:rPr>
+      </w:pPr>
+    </w:p>
+    <w:p>
+      <w:pPr>
+        <w:rPr>
+          <w:rFonts w:ascii="Calibri" w:hAnsi="Calibri" w:cs="Calibri"/>
+          <w:sz w:val="24"/>
+          <w:szCs w:val="24"/>
+          <w:lang w:val="en-US"/>
+        </w:rPr>
+      </w:pPr>
+    </w:p>
+    <w:p>
+      <w:pPr>
+        <w:rPr>
+          <w:rFonts w:ascii="Calibri" w:hAnsi="Calibri" w:cs="Calibri"/>
+          <w:sz w:val="24"/>
+          <w:szCs w:val="24"/>
+          <w:lang w:val="en-US"/>
+        </w:rPr>
+      </w:pPr>
+    </w:p>
+    <w:p>
+      <w:pPr>
+        <w:rPr>
+          <w:rFonts w:ascii="Calibri" w:hAnsi="Calibri" w:cs="Calibri"/>
+          <w:sz w:val="24"/>
+          <w:szCs w:val="24"/>
+          <w:lang w:val="en-US"/>
+        </w:rPr>
+      </w:pPr>
+      <w:r>
+        <w:rPr>
+          <w:rFonts w:ascii="Calibri" w:hAnsi="Calibri" w:cs="Calibri"/>
+          <w:sz w:val="24"/>
+          <w:szCs w:val="24"/>
+          <w:lang w:val="en-US"/>
+        </w:rPr>
+        <w:t>Welcome to the Product Details page for Pasticceria Papa, where we celebrate our delicious creations! Here, you can discover all the mouthwatering details about your favorite products, from scrumptious cakes to delightful pastries. Each product features a vibrant image and a detailed description, allowing you to appreciate its unique qualities.</w:t>
+      </w:r>
+    </w:p>
+    <w:p>
+      <w:pPr>
+        <w:rPr>
+          <w:rFonts w:ascii="Calibri" w:hAnsi="Calibri" w:cs="Calibri"/>
+          <w:sz w:val="24"/>
+          <w:szCs w:val="24"/>
+          <w:lang w:val="en-US"/>
+        </w:rPr>
+      </w:pPr>
+    </w:p>
+    <w:p>
+      <w:pPr>
+        <w:rPr>
+          <w:rFonts w:ascii="Calibri" w:hAnsi="Calibri" w:cs="Calibri"/>
+          <w:sz w:val="24"/>
+          <w:szCs w:val="24"/>
+          <w:lang w:val="en-US"/>
+        </w:rPr>
+      </w:pPr>
+      <w:r>
+        <w:rPr>
+          <w:rFonts w:ascii="Calibri" w:hAnsi="Calibri" w:cs="Calibri"/>
+          <w:sz w:val="24"/>
+          <w:szCs w:val="24"/>
+          <w:lang w:val="en-US"/>
+        </w:rPr>
+        <w:t>You'll find the price and category information clearly presented, making it easy to choose what you want. If you're ready to indulge, simply select the quantity and click the "Add to Cart" button. The user-friendly design and inviting atmosphere make your shopping experience enjoyable. Dive in and treat yourself to a little taste of heaven with our delightful offerings from Pasticceria Papa!</w:t>
+      </w:r>
+    </w:p>
+    <w:p>
+      <w:pPr>
+        <w:rPr>
+          <w:rFonts w:ascii="Calibri" w:hAnsi="Calibri" w:cs="Calibri"/>
+          <w:sz w:val="24"/>
+          <w:szCs w:val="24"/>
+          <w:lang w:val="en-US"/>
+        </w:rPr>
+      </w:pPr>
+    </w:p>
+    <w:p>
+      <w:pPr>
+        <w:rPr>
+          <w:rFonts w:ascii="Calibri" w:hAnsi="Calibri" w:cs="Calibri"/>
+          <w:sz w:val="24"/>
+          <w:szCs w:val="24"/>
+          <w:lang w:val="en-US"/>
+        </w:rPr>
+      </w:pPr>
+      <w:r>
+        <w:rPr>
+          <w:rFonts w:ascii="Calibri" w:hAnsi="Calibri" w:cs="Calibri"/>
+          <w:noProof/>
+          <w:sz w:val="24"/>
+          <w:szCs w:val="24"/>
+          <w:lang w:val="en-US"/>
+        </w:rPr>
+        <w:drawing>
+          <wp:inline distT="0" distB="0" distL="0" distR="0" wp14:anchorId="43236ABA" wp14:editId="2B41D1A1">
+            <wp:extent cx="5731510" cy="2597150"/>
+            <wp:effectExtent l="0" t="0" r="2540" b="0"/>
+            <wp:docPr id="1868515868" name="Picture 1" descr="A screenshot of a computer&#10;&#10;Description automatically generated"/>
+            <wp:cNvGraphicFramePr>
+              <a:graphicFrameLocks xmlns:a="http://schemas.openxmlformats.org/drawingml/2006/main" noChangeAspect="1"/>
+            </wp:cNvGraphicFramePr>
+            <a:graphic xmlns:a="http://schemas.openxmlformats.org/drawingml/2006/main">
+              <a:graphicData uri="http://schemas.openxmlformats.org/drawingml/2006/picture">
+                <pic:pic xmlns:pic="http://schemas.openxmlformats.org/drawingml/2006/picture">
+                  <pic:nvPicPr>
+                    <pic:cNvPr id="1868515868" name="Picture 1" descr="A screenshot of a computer&#10;&#10;Description automatically generated"/>
                     <pic:cNvPicPr/>
                   </pic:nvPicPr>
                   <pic:blipFill>
@@ -1426,7 +2417,7 @@
                   <pic:spPr>
                     <a:xfrm>
                       <a:off x="0" y="0"/>
-                      <a:ext cx="5731510" cy="2644775"/>
+                      <a:ext cx="5731510" cy="2597150"/>
                     </a:xfrm>
                     <a:prstGeom prst="rect">
                       <a:avLst/>
@@ -1438,6 +2429,169 @@
           </wp:inline>
         </w:drawing>
       </w:r>
+    </w:p>
+    <w:p>
+      <w:pPr>
+        <w:rPr>
+          <w:rFonts w:ascii="Calibri" w:hAnsi="Calibri" w:cs="Calibri"/>
+          <w:sz w:val="24"/>
+          <w:szCs w:val="24"/>
+          <w:lang w:val="en-US"/>
+        </w:rPr>
+      </w:pPr>
+    </w:p>
+    <w:p>
+      <w:pPr>
+        <w:rPr>
+          <w:rFonts w:ascii="Calibri" w:hAnsi="Calibri" w:cs="Calibri"/>
+          <w:sz w:val="24"/>
+          <w:szCs w:val="24"/>
+          <w:lang w:val="en-US"/>
+        </w:rPr>
+      </w:pPr>
+    </w:p>
+    <w:p>
+      <w:pPr>
+        <w:rPr>
+          <w:rFonts w:ascii="Calibri" w:hAnsi="Calibri" w:cs="Calibri"/>
+          <w:sz w:val="24"/>
+          <w:szCs w:val="24"/>
+          <w:lang w:val="en-US"/>
+        </w:rPr>
+      </w:pPr>
+    </w:p>
+    <w:p>
+      <w:pPr>
+        <w:rPr>
+          <w:rFonts w:ascii="Calibri" w:hAnsi="Calibri" w:cs="Calibri"/>
+          <w:sz w:val="24"/>
+          <w:szCs w:val="24"/>
+          <w:lang w:val="en-US"/>
+        </w:rPr>
+      </w:pPr>
+    </w:p>
+    <w:p>
+      <w:pPr>
+        <w:rPr>
+          <w:rFonts w:ascii="Calibri" w:hAnsi="Calibri" w:cs="Calibri"/>
+          <w:sz w:val="24"/>
+          <w:szCs w:val="24"/>
+          <w:lang w:val="en-US"/>
+        </w:rPr>
+      </w:pPr>
+    </w:p>
+    <w:p>
+      <w:pPr>
+        <w:rPr>
+          <w:rFonts w:ascii="Calibri" w:hAnsi="Calibri" w:cs="Calibri"/>
+          <w:sz w:val="24"/>
+          <w:szCs w:val="24"/>
+          <w:lang w:val="en-US"/>
+        </w:rPr>
+      </w:pPr>
+    </w:p>
+    <w:p>
+      <w:pPr>
+        <w:rPr>
+          <w:rFonts w:ascii="Calibri" w:hAnsi="Calibri" w:cs="Calibri"/>
+          <w:sz w:val="24"/>
+          <w:szCs w:val="24"/>
+          <w:lang w:val="en-US"/>
+        </w:rPr>
+      </w:pPr>
+    </w:p>
+    <w:p>
+      <w:pPr>
+        <w:rPr>
+          <w:rFonts w:ascii="Calibri" w:hAnsi="Calibri" w:cs="Calibri"/>
+          <w:sz w:val="24"/>
+          <w:szCs w:val="24"/>
+          <w:lang w:val="en-US"/>
+        </w:rPr>
+      </w:pPr>
+    </w:p>
+    <w:p>
+      <w:pPr>
+        <w:rPr>
+          <w:rFonts w:ascii="Calibri" w:hAnsi="Calibri" w:cs="Calibri"/>
+          <w:sz w:val="24"/>
+          <w:szCs w:val="24"/>
+          <w:lang w:val="en-US"/>
+        </w:rPr>
+      </w:pPr>
+    </w:p>
+    <w:p>
+      <w:pPr>
+        <w:rPr>
+          <w:rFonts w:ascii="Calibri" w:hAnsi="Calibri" w:cs="Calibri"/>
+          <w:sz w:val="24"/>
+          <w:szCs w:val="24"/>
+          <w:lang w:val="en-US"/>
+        </w:rPr>
+      </w:pPr>
+    </w:p>
+    <w:p>
+      <w:pPr>
+        <w:rPr>
+          <w:rFonts w:ascii="Calibri" w:hAnsi="Calibri" w:cs="Calibri"/>
+          <w:sz w:val="24"/>
+          <w:szCs w:val="24"/>
+          <w:lang w:val="en-US"/>
+        </w:rPr>
+      </w:pPr>
+      <w:r>
+        <w:rPr>
+          <w:rFonts w:ascii="Calibri" w:hAnsi="Calibri" w:cs="Calibri"/>
+          <w:sz w:val="24"/>
+          <w:szCs w:val="24"/>
+          <w:lang w:val="en-US"/>
+        </w:rPr>
+        <w:t>Welcome to the Shopping Cart page of Pasticceria Papa! Here, you can review all the delicious treats you’ve selected. If your cart is empty, no worries; it’s a great opportunity to explore our delightful catalogue.</w:t>
+      </w:r>
+    </w:p>
+    <w:p>
+      <w:pPr>
+        <w:rPr>
+          <w:rFonts w:ascii="Calibri" w:hAnsi="Calibri" w:cs="Calibri"/>
+          <w:sz w:val="24"/>
+          <w:szCs w:val="24"/>
+          <w:lang w:val="en-US"/>
+        </w:rPr>
+      </w:pPr>
+      <w:r>
+        <w:rPr>
+          <w:rFonts w:ascii="Calibri" w:hAnsi="Calibri" w:cs="Calibri"/>
+          <w:sz w:val="24"/>
+          <w:szCs w:val="24"/>
+          <w:lang w:val="en-US"/>
+        </w:rPr>
+        <w:t>Once you’ve added items, you can see the product image, price, quantity, and subtotal for each treat. If you change your mind about a pastry, simply click the “Remove” button next to it</w:t>
+      </w:r>
+      <w:r>
+        <w:rPr>
+          <w:rFonts w:ascii="Calibri" w:hAnsi="Calibri" w:cs="Calibri"/>
+          <w:sz w:val="24"/>
+          <w:szCs w:val="24"/>
+          <w:lang w:val="en-US"/>
+        </w:rPr>
+        <w:t>.</w:t>
+      </w:r>
+    </w:p>
+    <w:p>
+      <w:pPr>
+        <w:rPr>
+          <w:noProof/>
+        </w:rPr>
+      </w:pPr>
+      <w:r>
+        <w:rPr>
+          <w:rFonts w:ascii="Calibri" w:hAnsi="Calibri" w:cs="Calibri"/>
+          <w:sz w:val="24"/>
+          <w:szCs w:val="24"/>
+          <w:lang w:val="en-US"/>
+        </w:rPr>
+        <w:t xml:space="preserve">At the bottom, you'll find your total amount, along with options to continue shopping, clear your cart, or proceed to checkout. We aim to make your shopping experience enjoyable and </w:t>
+      </w:r>
       <w:r>
         <w:rPr>
           <w:rFonts w:ascii="Calibri" w:hAnsi="Calibri" w:cs="Calibri"/>
@@ -1446,11 +2600,21 @@
           <w:lang w:val="en-US"/>
         </w:rPr>
         <w:lastRenderedPageBreak/>
+        <w:t>straightforward. Thank you for choosing us, and happy indulging!</w:t>
+      </w:r>
+      <w:r>
+        <w:rPr>
+          <w:rFonts w:ascii="Calibri" w:hAnsi="Calibri" w:cs="Calibri"/>
+          <w:noProof/>
+          <w:sz w:val="24"/>
+          <w:szCs w:val="24"/>
+          <w:lang w:val="en-US"/>
+        </w:rPr>
         <w:drawing>
-          <wp:inline distT="0" distB="0" distL="0" distR="0" wp14:anchorId="38357AD4" wp14:editId="3C105EEB">
-            <wp:extent cx="5731510" cy="2560955"/>
+          <wp:inline distT="0" distB="0" distL="0" distR="0" wp14:anchorId="4C175976" wp14:editId="76BBFA93">
+            <wp:extent cx="5731510" cy="2593975"/>
             <wp:effectExtent l="0" t="0" r="2540" b="0"/>
-            <wp:docPr id="602770808" name="Picture 1" descr="A screenshot of a checkout&#10;&#10;Description automatically generated"/>
+            <wp:docPr id="153217947" name="Picture 1" descr="A screenshot of a shopping cart&#10;&#10;Description automatically generated"/>
             <wp:cNvGraphicFramePr>
               <a:graphicFrameLocks xmlns:a="http://schemas.openxmlformats.org/drawingml/2006/main" noChangeAspect="1"/>
             </wp:cNvGraphicFramePr>
@@ -1458,7 +2622,7 @@
               <a:graphicData uri="http://schemas.openxmlformats.org/drawingml/2006/picture">
                 <pic:pic xmlns:pic="http://schemas.openxmlformats.org/drawingml/2006/picture">
                   <pic:nvPicPr>
-                    <pic:cNvPr id="602770808" name="Picture 1" descr="A screenshot of a checkout&#10;&#10;Description automatically generated"/>
+                    <pic:cNvPr id="153217947" name="Picture 1" descr="A screenshot of a shopping cart&#10;&#10;Description automatically generated"/>
                     <pic:cNvPicPr/>
                   </pic:nvPicPr>
                   <pic:blipFill>
@@ -1470,7 +2634,7 @@
                   <pic:spPr>
                     <a:xfrm>
                       <a:off x="0" y="0"/>
-                      <a:ext cx="5731510" cy="2560955"/>
+                      <a:ext cx="5731510" cy="2593975"/>
                     </a:xfrm>
                     <a:prstGeom prst="rect">
                       <a:avLst/>
@@ -1484,16 +2648,200 @@
       </w:r>
       <w:r>
         <w:rPr>
-          <w:rFonts w:ascii="Calibri" w:hAnsi="Calibri" w:cs="Calibri"/>
+          <w:noProof/>
+        </w:rPr>
+        <w:t xml:space="preserve"> </w:t>
+      </w:r>
+    </w:p>
+    <w:p>
+      <w:pPr>
+        <w:rPr>
+          <w:noProof/>
+        </w:rPr>
+      </w:pPr>
+    </w:p>
+    <w:p>
+      <w:pPr>
+        <w:rPr>
+          <w:noProof/>
+        </w:rPr>
+      </w:pPr>
+    </w:p>
+    <w:p>
+      <w:pPr>
+        <w:rPr>
+          <w:noProof/>
+        </w:rPr>
+      </w:pPr>
+    </w:p>
+    <w:p>
+      <w:pPr>
+        <w:rPr>
+          <w:noProof/>
+        </w:rPr>
+      </w:pPr>
+    </w:p>
+    <w:p>
+      <w:pPr>
+        <w:rPr>
+          <w:noProof/>
+        </w:rPr>
+      </w:pPr>
+    </w:p>
+    <w:p>
+      <w:pPr>
+        <w:rPr>
+          <w:noProof/>
+        </w:rPr>
+      </w:pPr>
+    </w:p>
+    <w:p>
+      <w:pPr>
+        <w:rPr>
+          <w:noProof/>
+        </w:rPr>
+      </w:pPr>
+    </w:p>
+    <w:p>
+      <w:pPr>
+        <w:rPr>
+          <w:noProof/>
+        </w:rPr>
+      </w:pPr>
+    </w:p>
+    <w:p>
+      <w:pPr>
+        <w:rPr>
+          <w:noProof/>
+        </w:rPr>
+      </w:pPr>
+    </w:p>
+    <w:p>
+      <w:pPr>
+        <w:rPr>
+          <w:noProof/>
+        </w:rPr>
+      </w:pPr>
+    </w:p>
+    <w:p>
+      <w:pPr>
+        <w:rPr>
+          <w:noProof/>
+        </w:rPr>
+      </w:pPr>
+    </w:p>
+    <w:p>
+      <w:pPr>
+        <w:rPr>
+          <w:noProof/>
+        </w:rPr>
+      </w:pPr>
+    </w:p>
+    <w:p>
+      <w:pPr>
+        <w:rPr>
+          <w:noProof/>
+        </w:rPr>
+      </w:pPr>
+    </w:p>
+    <w:p>
+      <w:pPr>
+        <w:rPr>
+          <w:noProof/>
+        </w:rPr>
+      </w:pPr>
+    </w:p>
+    <w:p>
+      <w:pPr>
+        <w:rPr>
+          <w:rFonts w:ascii="Calibri" w:hAnsi="Calibri" w:cs="Calibri"/>
+          <w:noProof/>
+          <w:sz w:val="24"/>
+          <w:szCs w:val="24"/>
+        </w:rPr>
+      </w:pPr>
+      <w:r>
+        <w:rPr>
+          <w:rFonts w:ascii="Calibri" w:hAnsi="Calibri" w:cs="Calibri"/>
+          <w:noProof/>
+          <w:sz w:val="24"/>
+          <w:szCs w:val="24"/>
+        </w:rPr>
+        <w:t>Welcome to the Checkout page at Pasticceria Papa! Here, you can finalize your delicious order and enjoy a seamless shopping experience. We’ve designed this page to be user-friendly, guiding you through providing your full name, address, and preferred payment method.</w:t>
+      </w:r>
+    </w:p>
+    <w:p>
+      <w:pPr>
+        <w:rPr>
+          <w:rFonts w:ascii="Calibri" w:hAnsi="Calibri" w:cs="Calibri"/>
+          <w:noProof/>
+          <w:sz w:val="24"/>
+          <w:szCs w:val="24"/>
+        </w:rPr>
+      </w:pPr>
+      <w:r>
+        <w:rPr>
+          <w:rFonts w:ascii="Calibri" w:hAnsi="Calibri" w:cs="Calibri"/>
+          <w:noProof/>
+          <w:sz w:val="24"/>
+          <w:szCs w:val="24"/>
+        </w:rPr>
+        <w:t>If you choose to pay by credit card, you’ll be prompted to enter your card details securely. Additionally, you’ll see a clear order summary, detailing each product, quantity, and the total amount, ensuring you know exactly what you’re purchasing.</w:t>
+      </w:r>
+    </w:p>
+    <w:p>
+      <w:pPr>
+        <w:rPr>
+          <w:rFonts w:ascii="Calibri" w:hAnsi="Calibri" w:cs="Calibri"/>
+          <w:noProof/>
+          <w:sz w:val="24"/>
+          <w:szCs w:val="24"/>
+        </w:rPr>
+      </w:pPr>
+      <w:r>
+        <w:rPr>
+          <w:rFonts w:ascii="Calibri" w:hAnsi="Calibri" w:cs="Calibri"/>
+          <w:noProof/>
+          <w:sz w:val="24"/>
+          <w:szCs w:val="24"/>
+        </w:rPr>
+        <w:lastRenderedPageBreak/>
+        <w:t>Once everything is set, simply hit the “Place Order” button, and you’ll be one step closer to indulging in our delightful pastries. Thank you for choosing us, and happy shopping!</w:t>
+      </w:r>
+    </w:p>
+    <w:p>
+      <w:pPr>
+        <w:rPr>
+          <w:noProof/>
+        </w:rPr>
+      </w:pPr>
+    </w:p>
+    <w:p>
+      <w:pPr>
+        <w:rPr>
+          <w:noProof/>
+        </w:rPr>
+      </w:pPr>
+    </w:p>
+    <w:p>
+      <w:pPr>
+        <w:rPr>
+          <w:noProof/>
+        </w:rPr>
+      </w:pPr>
+      <w:r>
+        <w:rPr>
+          <w:rFonts w:ascii="Calibri" w:hAnsi="Calibri" w:cs="Calibri"/>
+          <w:noProof/>
           <w:sz w:val="24"/>
           <w:szCs w:val="24"/>
           <w:lang w:val="en-US"/>
         </w:rPr>
         <w:drawing>
-          <wp:inline distT="0" distB="0" distL="0" distR="0" wp14:anchorId="2BA5D9D5" wp14:editId="7BE987D7">
-            <wp:extent cx="5731510" cy="2623820"/>
-            <wp:effectExtent l="0" t="0" r="2540" b="5080"/>
-            <wp:docPr id="32082002" name="Picture 1" descr="A screenshot of a computer&#10;&#10;Description automatically generated"/>
+          <wp:inline distT="0" distB="0" distL="0" distR="0" wp14:anchorId="0A787A41" wp14:editId="406B252D">
+            <wp:extent cx="5731510" cy="2600960"/>
+            <wp:effectExtent l="0" t="0" r="2540" b="8890"/>
+            <wp:docPr id="1746824562" name="Picture 1" descr="A screenshot of a computer screen&#10;&#10;Description automatically generated"/>
             <wp:cNvGraphicFramePr>
               <a:graphicFrameLocks xmlns:a="http://schemas.openxmlformats.org/drawingml/2006/main" noChangeAspect="1"/>
             </wp:cNvGraphicFramePr>
@@ -1501,7 +2849,7 @@
               <a:graphicData uri="http://schemas.openxmlformats.org/drawingml/2006/picture">
                 <pic:pic xmlns:pic="http://schemas.openxmlformats.org/drawingml/2006/picture">
                   <pic:nvPicPr>
-                    <pic:cNvPr id="32082002" name="Picture 1" descr="A screenshot of a computer&#10;&#10;Description automatically generated"/>
+                    <pic:cNvPr id="1746824562" name="Picture 1" descr="A screenshot of a computer screen&#10;&#10;Description automatically generated"/>
                     <pic:cNvPicPr/>
                   </pic:nvPicPr>
                   <pic:blipFill>
@@ -1513,7 +2861,187 @@
                   <pic:spPr>
                     <a:xfrm>
                       <a:off x="0" y="0"/>
-                      <a:ext cx="5731510" cy="2623820"/>
+                      <a:ext cx="5731510" cy="2600960"/>
+                    </a:xfrm>
+                    <a:prstGeom prst="rect">
+                      <a:avLst/>
+                    </a:prstGeom>
+                  </pic:spPr>
+                </pic:pic>
+              </a:graphicData>
+            </a:graphic>
+          </wp:inline>
+        </w:drawing>
+      </w:r>
+    </w:p>
+    <w:p>
+      <w:pPr>
+        <w:rPr>
+          <w:noProof/>
+        </w:rPr>
+      </w:pPr>
+      <w:r>
+        <w:rPr>
+          <w:noProof/>
+        </w:rPr>
+        <w:drawing>
+          <wp:inline distT="0" distB="0" distL="0" distR="0" wp14:anchorId="37841895" wp14:editId="4A1C792F">
+            <wp:extent cx="5731510" cy="2581910"/>
+            <wp:effectExtent l="0" t="0" r="2540" b="8890"/>
+            <wp:docPr id="1955873816" name="Picture 1" descr="A screenshot of a computer&#10;&#10;Description automatically generated"/>
+            <wp:cNvGraphicFramePr>
+              <a:graphicFrameLocks xmlns:a="http://schemas.openxmlformats.org/drawingml/2006/main" noChangeAspect="1"/>
+            </wp:cNvGraphicFramePr>
+            <a:graphic xmlns:a="http://schemas.openxmlformats.org/drawingml/2006/main">
+              <a:graphicData uri="http://schemas.openxmlformats.org/drawingml/2006/picture">
+                <pic:pic xmlns:pic="http://schemas.openxmlformats.org/drawingml/2006/picture">
+                  <pic:nvPicPr>
+                    <pic:cNvPr id="1955873816" name="Picture 1" descr="A screenshot of a computer&#10;&#10;Description automatically generated"/>
+                    <pic:cNvPicPr/>
+                  </pic:nvPicPr>
+                  <pic:blipFill>
+                    <a:blip r:embed="rId15"/>
+                    <a:stretch>
+                      <a:fillRect/>
+                    </a:stretch>
+                  </pic:blipFill>
+                  <pic:spPr>
+                    <a:xfrm>
+                      <a:off x="0" y="0"/>
+                      <a:ext cx="5731510" cy="2581910"/>
+                    </a:xfrm>
+                    <a:prstGeom prst="rect">
+                      <a:avLst/>
+                    </a:prstGeom>
+                  </pic:spPr>
+                </pic:pic>
+              </a:graphicData>
+            </a:graphic>
+          </wp:inline>
+        </w:drawing>
+      </w:r>
+    </w:p>
+    <w:p>
+      <w:pPr>
+        <w:rPr>
+          <w:noProof/>
+        </w:rPr>
+      </w:pPr>
+    </w:p>
+    <w:p>
+      <w:pPr>
+        <w:rPr>
+          <w:noProof/>
+        </w:rPr>
+      </w:pPr>
+    </w:p>
+    <w:p>
+      <w:pPr>
+        <w:rPr>
+          <w:noProof/>
+        </w:rPr>
+      </w:pPr>
+    </w:p>
+    <w:p>
+      <w:pPr>
+        <w:rPr>
+          <w:rFonts w:ascii="Calibri" w:hAnsi="Calibri" w:cs="Calibri"/>
+          <w:noProof/>
+          <w:sz w:val="24"/>
+          <w:szCs w:val="24"/>
+        </w:rPr>
+      </w:pPr>
+      <w:r>
+        <w:rPr>
+          <w:rFonts w:ascii="Calibri" w:hAnsi="Calibri" w:cs="Calibri"/>
+          <w:noProof/>
+          <w:sz w:val="24"/>
+          <w:szCs w:val="24"/>
+        </w:rPr>
+        <w:t>Welcome to the Order Confirmation page of Pasticceria Papa! We’re thrilled to inform you that your order has been successfully placed. Thank you for choosing us to satisfy your sweet cravings!</w:t>
+      </w:r>
+    </w:p>
+    <w:p>
+      <w:pPr>
+        <w:rPr>
+          <w:rFonts w:ascii="Calibri" w:hAnsi="Calibri" w:cs="Calibri"/>
+          <w:noProof/>
+          <w:sz w:val="24"/>
+          <w:szCs w:val="24"/>
+        </w:rPr>
+      </w:pPr>
+      <w:r>
+        <w:rPr>
+          <w:rFonts w:ascii="Calibri" w:hAnsi="Calibri" w:cs="Calibri"/>
+          <w:noProof/>
+          <w:sz w:val="24"/>
+          <w:szCs w:val="24"/>
+        </w:rPr>
+        <w:t>Here, you’ll find a warm message thanking you for your purchase, along with assurance that a confirmation email will be sent shortly. This page is designed to make you feel appreciated and informed about your order status.</w:t>
+      </w:r>
+    </w:p>
+    <w:p>
+      <w:pPr>
+        <w:rPr>
+          <w:rFonts w:ascii="Calibri" w:hAnsi="Calibri" w:cs="Calibri"/>
+          <w:noProof/>
+          <w:sz w:val="24"/>
+          <w:szCs w:val="24"/>
+        </w:rPr>
+      </w:pPr>
+      <w:r>
+        <w:rPr>
+          <w:rFonts w:ascii="Calibri" w:hAnsi="Calibri" w:cs="Calibri"/>
+          <w:noProof/>
+          <w:sz w:val="24"/>
+          <w:szCs w:val="24"/>
+        </w:rPr>
+        <w:lastRenderedPageBreak/>
+        <w:t>If you’re ready to continue your culinary journey, simply click the “Continue Shopping” button to explore more delicious treats from our catalogue. We hope you enjoy your delightful selections, and we look forward to serving you again soon at Pasticceria Papa!</w:t>
+      </w:r>
+    </w:p>
+    <w:p>
+      <w:pPr>
+        <w:rPr>
+          <w:rFonts w:ascii="Calibri" w:hAnsi="Calibri" w:cs="Calibri"/>
+          <w:sz w:val="24"/>
+          <w:szCs w:val="24"/>
+          <w:lang w:val="en-US"/>
+        </w:rPr>
+      </w:pPr>
+      <w:r>
+        <w:rPr>
+          <w:rFonts w:ascii="Calibri" w:hAnsi="Calibri" w:cs="Calibri"/>
+          <w:noProof/>
+          <w:sz w:val="24"/>
+          <w:szCs w:val="24"/>
+          <w:lang w:val="en-US"/>
+        </w:rPr>
+        <w:drawing>
+          <wp:inline distT="0" distB="0" distL="0" distR="0" wp14:anchorId="1A13833D" wp14:editId="4C48C9E4">
+            <wp:extent cx="5731510" cy="2609215"/>
+            <wp:effectExtent l="0" t="0" r="2540" b="635"/>
+            <wp:docPr id="869228516" name="Picture 1" descr="A screenshot of a computer&#10;&#10;Description automatically generated"/>
+            <wp:cNvGraphicFramePr>
+              <a:graphicFrameLocks xmlns:a="http://schemas.openxmlformats.org/drawingml/2006/main" noChangeAspect="1"/>
+            </wp:cNvGraphicFramePr>
+            <a:graphic xmlns:a="http://schemas.openxmlformats.org/drawingml/2006/main">
+              <a:graphicData uri="http://schemas.openxmlformats.org/drawingml/2006/picture">
+                <pic:pic xmlns:pic="http://schemas.openxmlformats.org/drawingml/2006/picture">
+                  <pic:nvPicPr>
+                    <pic:cNvPr id="869228516" name="Picture 1" descr="A screenshot of a computer&#10;&#10;Description automatically generated"/>
+                    <pic:cNvPicPr/>
+                  </pic:nvPicPr>
+                  <pic:blipFill>
+                    <a:blip r:embed="rId16"/>
+                    <a:stretch>
+                      <a:fillRect/>
+                    </a:stretch>
+                  </pic:blipFill>
+                  <pic:spPr>
+                    <a:xfrm>
+                      <a:off x="0" y="0"/>
+                      <a:ext cx="5731510" cy="2609215"/>
                     </a:xfrm>
                     <a:prstGeom prst="rect">
                       <a:avLst/>

</xml_diff>